<commit_message>
CDC en format pdf et word
</commit_message>
<xml_diff>
--- a/CDC Fyord - Application mobile.docx
+++ b/CDC Fyord - Application mobile.docx
@@ -1248,7 +1248,9 @@
               <w:autoSpaceDN w:val="0"/>
               <w:adjustRightInd w:val="0"/>
               <w:rPr>
-                <w:rFonts w:cstheme="minorHAnsi"/>
+                <w:rFonts w:ascii="Segoe UI" w:hAnsi="Segoe UI" w:cs="Segoe UI"/>
+                <w:color w:val="212529"/>
+                <w:shd w:val="clear" w:color="auto" w:fill="FFFFFF"/>
               </w:rPr>
             </w:pPr>
             <w:r>
@@ -1266,7 +1268,51 @@
                 <w:color w:val="212529"/>
                 <w:shd w:val="clear" w:color="auto" w:fill="FFFFFF"/>
               </w:rPr>
-              <w:t>: du sa. 10 février au di. 18 février 2024</w:t>
+              <w:t xml:space="preserve">: du </w:t>
+            </w:r>
+            <w:proofErr w:type="spellStart"/>
+            <w:r>
+              <w:rPr>
+                <w:rFonts w:ascii="Segoe UI" w:hAnsi="Segoe UI" w:cs="Segoe UI"/>
+                <w:color w:val="212529"/>
+                <w:shd w:val="clear" w:color="auto" w:fill="FFFFFF"/>
+              </w:rPr>
+              <w:t>sa</w:t>
+            </w:r>
+            <w:proofErr w:type="spellEnd"/>
+            <w:r>
+              <w:rPr>
+                <w:rFonts w:ascii="Segoe UI" w:hAnsi="Segoe UI" w:cs="Segoe UI"/>
+                <w:color w:val="212529"/>
+                <w:shd w:val="clear" w:color="auto" w:fill="FFFFFF"/>
+              </w:rPr>
+              <w:t>. 10 février au di. 18 février 2024</w:t>
+            </w:r>
+            <w:r>
+              <w:rPr>
+                <w:rFonts w:ascii="Segoe UI" w:hAnsi="Segoe UI" w:cs="Segoe UI"/>
+                <w:color w:val="212529"/>
+                <w:shd w:val="clear" w:color="auto" w:fill="FFFFFF"/>
+              </w:rPr>
+              <w:t xml:space="preserve"> </w:t>
+            </w:r>
+            <w:proofErr w:type="gramStart"/>
+            <w:r>
+              <w:rPr>
+                <w:rFonts w:ascii="Segoe UI" w:hAnsi="Segoe UI" w:cs="Segoe UI"/>
+                <w:color w:val="212529"/>
+                <w:shd w:val="clear" w:color="auto" w:fill="FFFFFF"/>
+              </w:rPr>
+              <w:t>( -</w:t>
+            </w:r>
+            <w:proofErr w:type="gramEnd"/>
+            <w:r>
+              <w:rPr>
+                <w:rFonts w:ascii="Segoe UI" w:hAnsi="Segoe UI" w:cs="Segoe UI"/>
+                <w:color w:val="212529"/>
+                <w:shd w:val="clear" w:color="auto" w:fill="FFFFFF"/>
+              </w:rPr>
+              <w:t xml:space="preserve"> 29 périodes )</w:t>
             </w:r>
           </w:p>
           <w:p>
@@ -1278,11 +1324,41 @@
                 <w:rFonts w:cstheme="minorHAnsi"/>
               </w:rPr>
             </w:pPr>
-            <w:r>
-              <w:rPr>
-                <w:rFonts w:cstheme="minorHAnsi"/>
-              </w:rPr>
-              <w:t>8 + 8 + 4 + 9 = 29</w:t>
+            <w:proofErr w:type="spellStart"/>
+            <w:r>
+              <w:rPr>
+                <w:rFonts w:ascii="Segoe UI" w:hAnsi="Segoe UI" w:cs="Segoe UI"/>
+                <w:color w:val="212529"/>
+                <w:shd w:val="clear" w:color="auto" w:fill="FFFFFF"/>
+              </w:rPr>
+              <w:t>Feriés</w:t>
+            </w:r>
+            <w:proofErr w:type="spellEnd"/>
+            <w:r>
+              <w:rPr>
+                <w:rFonts w:ascii="Segoe UI" w:hAnsi="Segoe UI" w:cs="Segoe UI"/>
+                <w:color w:val="212529"/>
+                <w:shd w:val="clear" w:color="auto" w:fill="FFFFFF"/>
+              </w:rPr>
+              <w:t xml:space="preserve"> : lu. 19 février 2024 </w:t>
+            </w:r>
+            <w:proofErr w:type="gramStart"/>
+            <w:r>
+              <w:rPr>
+                <w:rFonts w:ascii="Segoe UI" w:hAnsi="Segoe UI" w:cs="Segoe UI"/>
+                <w:color w:val="212529"/>
+                <w:shd w:val="clear" w:color="auto" w:fill="FFFFFF"/>
+              </w:rPr>
+              <w:t>( -</w:t>
+            </w:r>
+            <w:proofErr w:type="gramEnd"/>
+            <w:r>
+              <w:rPr>
+                <w:rFonts w:ascii="Segoe UI" w:hAnsi="Segoe UI" w:cs="Segoe UI"/>
+                <w:color w:val="212529"/>
+                <w:shd w:val="clear" w:color="auto" w:fill="FFFFFF"/>
+              </w:rPr>
+              <w:t xml:space="preserve"> 8 périodes )</w:t>
             </w:r>
           </w:p>
           <w:p>
@@ -1298,7 +1374,7 @@
               <w:rPr>
                 <w:rFonts w:cstheme="minorHAnsi"/>
               </w:rPr>
-              <w:t>7 * 29 = 203</w:t>
+              <w:t>8 + 8 + 4 + 9 = 29</w:t>
             </w:r>
           </w:p>
           <w:p>
@@ -1314,7 +1390,13 @@
               <w:rPr>
                 <w:rFonts w:cstheme="minorHAnsi"/>
               </w:rPr>
-              <w:t>203 * 45 / 60 = 152.25 H</w:t>
+              <w:t xml:space="preserve">7 * 29 = </w:t>
+            </w:r>
+            <w:r>
+              <w:rPr>
+                <w:rFonts w:cstheme="minorHAnsi"/>
+              </w:rPr>
+              <w:t>195</w:t>
             </w:r>
           </w:p>
           <w:p>
@@ -1330,7 +1412,43 @@
               <w:rPr>
                 <w:rFonts w:cstheme="minorHAnsi"/>
               </w:rPr>
-              <w:t>152H et 15 minutes de travail au total</w:t>
+              <w:t>195 * 45 / 60 = 146</w:t>
+            </w:r>
+            <w:r>
+              <w:rPr>
+                <w:rFonts w:cstheme="minorHAnsi"/>
+              </w:rPr>
+              <w:t>.25 H</w:t>
+            </w:r>
+          </w:p>
+          <w:p>
+            <w:pPr>
+              <w:autoSpaceDE w:val="0"/>
+              <w:autoSpaceDN w:val="0"/>
+              <w:adjustRightInd w:val="0"/>
+              <w:rPr>
+                <w:rFonts w:cstheme="minorHAnsi"/>
+              </w:rPr>
+            </w:pPr>
+            <w:r>
+              <w:rPr>
+                <w:rFonts w:cstheme="minorHAnsi"/>
+              </w:rPr>
+              <w:t>146</w:t>
+            </w:r>
+            <w:r>
+              <w:rPr>
+                <w:rFonts w:cstheme="minorHAnsi"/>
+              </w:rPr>
+              <w:t xml:space="preserve">H </w:t>
+            </w:r>
+            <w:bookmarkStart w:id="0" w:name="_GoBack"/>
+            <w:bookmarkEnd w:id="0"/>
+            <w:r>
+              <w:rPr>
+                <w:rFonts w:cstheme="minorHAnsi"/>
+              </w:rPr>
+              <w:t>et 15 minutes de travail au total</w:t>
             </w:r>
           </w:p>
         </w:tc>
@@ -1386,7 +1504,19 @@
               <w:rPr>
                 <w:rFonts w:cstheme="minorHAnsi"/>
               </w:rPr>
-              <w:t>152H et 15 minutes</w:t>
+              <w:t>146</w:t>
+            </w:r>
+            <w:r>
+              <w:rPr>
+                <w:rFonts w:cstheme="minorHAnsi"/>
+              </w:rPr>
+              <w:t xml:space="preserve">H </w:t>
+            </w:r>
+            <w:r>
+              <w:rPr>
+                <w:rFonts w:cstheme="minorHAnsi"/>
+              </w:rPr>
+              <w:t>et 15 minutes</w:t>
             </w:r>
           </w:p>
         </w:tc>
@@ -1667,8 +1797,6 @@
       <w:r>
         <w:t>ROCÉDURE</w:t>
       </w:r>
-      <w:bookmarkStart w:id="0" w:name="_GoBack"/>
-      <w:bookmarkEnd w:id="0"/>
     </w:p>
     <w:p>
       <w:pPr>
@@ -1833,12 +1961,21 @@
         </w:rPr>
         <w:t xml:space="preserve">En cas de problèmes graves, le candidat avertit au plus vite les deux experts et son </w:t>
       </w:r>
+      <w:proofErr w:type="spellStart"/>
       <w:r>
         <w:rPr>
           <w:rFonts w:eastAsiaTheme="minorHAnsi" w:cstheme="minorBidi"/>
           <w:lang w:val="fr-CH" w:eastAsia="en-US"/>
         </w:rPr>
-        <w:t>CdP.</w:t>
+        <w:t>CdP</w:t>
+      </w:r>
+      <w:proofErr w:type="spellEnd"/>
+      <w:r>
+        <w:rPr>
+          <w:rFonts w:eastAsiaTheme="minorHAnsi" w:cstheme="minorBidi"/>
+          <w:lang w:val="fr-CH" w:eastAsia="en-US"/>
+        </w:rPr>
+        <w:t>.</w:t>
       </w:r>
     </w:p>
     <w:p>
@@ -1916,11 +2053,21 @@
         <w:spacing w:after="0"/>
         <w:ind w:left="426"/>
       </w:pPr>
-      <w:r>
-        <w:t xml:space="preserve">Fyord - </w:t>
-      </w:r>
-      <w:r>
-        <w:t>Runeo-Drive</w:t>
+      <w:proofErr w:type="spellStart"/>
+      <w:r>
+        <w:t>Fyord</w:t>
+      </w:r>
+      <w:proofErr w:type="spellEnd"/>
+      <w:r>
+        <w:t xml:space="preserve"> - </w:t>
+      </w:r>
+      <w:proofErr w:type="spellStart"/>
+      <w:r>
+        <w:t>Runeo</w:t>
+      </w:r>
+      <w:proofErr w:type="spellEnd"/>
+      <w:r>
+        <w:t>-Drive</w:t>
       </w:r>
     </w:p>
     <w:p>
@@ -1968,7 +2115,15 @@
         <w:spacing w:after="0"/>
       </w:pPr>
       <w:r>
-        <w:t xml:space="preserve">Infrastructure IceScrum dédiée : etml.icescrum.com </w:t>
+        <w:t xml:space="preserve">Infrastructure </w:t>
+      </w:r>
+      <w:proofErr w:type="spellStart"/>
+      <w:r>
+        <w:t>IceScrum</w:t>
+      </w:r>
+      <w:proofErr w:type="spellEnd"/>
+      <w:r>
+        <w:t xml:space="preserve"> dédiée : etml.icescrum.com </w:t>
       </w:r>
     </w:p>
     <w:p>
@@ -1981,10 +2136,25 @@
         <w:spacing w:after="0"/>
       </w:pPr>
       <w:r>
-        <w:t>Accès en lecture/écriture au repository «</w:t>
-      </w:r>
-      <w:r>
-        <w:t xml:space="preserve">Runeo-Drive </w:t>
+        <w:t xml:space="preserve">Accès en lecture/écriture au </w:t>
+      </w:r>
+      <w:proofErr w:type="spellStart"/>
+      <w:r>
+        <w:t>repository</w:t>
+      </w:r>
+      <w:proofErr w:type="spellEnd"/>
+      <w:proofErr w:type="gramStart"/>
+      <w:r>
+        <w:t xml:space="preserve"> «</w:t>
+      </w:r>
+      <w:proofErr w:type="spellStart"/>
+      <w:r>
+        <w:t>Runeo</w:t>
+      </w:r>
+      <w:proofErr w:type="spellEnd"/>
+      <w:proofErr w:type="gramEnd"/>
+      <w:r>
+        <w:t xml:space="preserve">-Drive </w:t>
       </w:r>
       <w:r>
         <w:t>»</w:t>
@@ -2039,16 +2209,26 @@
       <w:pPr>
         <w:pStyle w:val="Corpsdetexte"/>
       </w:pPr>
-      <w:r>
-        <w:t>Fyord est une startup dont le but est de fournir un service numérique d’aide à l’organisation de transport de personnes dans le cadre d’événements culturels ou sportifs de grande taille.</w:t>
+      <w:proofErr w:type="spellStart"/>
+      <w:r>
+        <w:t>Fyord</w:t>
+      </w:r>
+      <w:proofErr w:type="spellEnd"/>
+      <w:r>
+        <w:t xml:space="preserve"> est une startup dont le but est de fournir un service numérique d’aide à l’organisation de transport de personnes dans le cadre d’événements culturels ou sportifs de grande taille.</w:t>
       </w:r>
     </w:p>
     <w:p>
       <w:pPr>
         <w:pStyle w:val="Corpsdetexte"/>
       </w:pPr>
-      <w:r>
-        <w:t xml:space="preserve">Fyord </w:t>
+      <w:proofErr w:type="spellStart"/>
+      <w:r>
+        <w:t>Fyord</w:t>
+      </w:r>
+      <w:proofErr w:type="spellEnd"/>
+      <w:r>
+        <w:t xml:space="preserve"> </w:t>
       </w:r>
       <w:r>
         <w:t>est issue du développement de</w:t>
@@ -2060,10 +2240,34 @@
         <w:t xml:space="preserve">web </w:t>
       </w:r>
       <w:r>
-        <w:t>« Runeo-Desk »</w:t>
-      </w:r>
-      <w:r>
-        <w:t xml:space="preserve"> et de sa companion-app « Runeo-Drive »</w:t>
+        <w:t>« </w:t>
+      </w:r>
+      <w:proofErr w:type="spellStart"/>
+      <w:r>
+        <w:t>Runeo</w:t>
+      </w:r>
+      <w:proofErr w:type="spellEnd"/>
+      <w:r>
+        <w:t>-Desk »</w:t>
+      </w:r>
+      <w:r>
+        <w:t xml:space="preserve"> et de sa </w:t>
+      </w:r>
+      <w:proofErr w:type="spellStart"/>
+      <w:r>
+        <w:t>companion-app</w:t>
+      </w:r>
+      <w:proofErr w:type="spellEnd"/>
+      <w:r>
+        <w:t xml:space="preserve"> « </w:t>
+      </w:r>
+      <w:proofErr w:type="spellStart"/>
+      <w:r>
+        <w:t>Runeo</w:t>
+      </w:r>
+      <w:proofErr w:type="spellEnd"/>
+      <w:r>
+        <w:t>-Drive »</w:t>
       </w:r>
       <w:r>
         <w:t xml:space="preserve">, </w:t>
@@ -2096,10 +2300,32 @@
         <w:rPr>
           <w:rStyle w:val="normaltextrun"/>
         </w:rPr>
-        <w:t xml:space="preserve"> Paleo </w:t>
-      </w:r>
-      <w:r>
-        <w:t xml:space="preserve">et les Eurockéennes </w:t>
+        <w:t xml:space="preserve"> </w:t>
+      </w:r>
+      <w:proofErr w:type="spellStart"/>
+      <w:r>
+        <w:rPr>
+          <w:rStyle w:val="normaltextrun"/>
+        </w:rPr>
+        <w:t>Paleo</w:t>
+      </w:r>
+      <w:proofErr w:type="spellEnd"/>
+      <w:r>
+        <w:rPr>
+          <w:rStyle w:val="normaltextrun"/>
+        </w:rPr>
+        <w:t xml:space="preserve"> </w:t>
+      </w:r>
+      <w:r>
+        <w:t xml:space="preserve">et les </w:t>
+      </w:r>
+      <w:proofErr w:type="spellStart"/>
+      <w:r>
+        <w:t>Eurockéennes</w:t>
+      </w:r>
+      <w:proofErr w:type="spellEnd"/>
+      <w:r>
+        <w:t xml:space="preserve"> </w:t>
       </w:r>
       <w:r>
         <w:rPr>
@@ -2117,7 +2343,21 @@
         <w:rPr>
           <w:rStyle w:val="normaltextrun"/>
         </w:rPr>
-        <w:t xml:space="preserve"> de leur entourage (staff, agent, musiciens, …).</w:t>
+        <w:t xml:space="preserve"> de leur entourage (staff, agent, </w:t>
+      </w:r>
+      <w:proofErr w:type="gramStart"/>
+      <w:r>
+        <w:rPr>
+          <w:rStyle w:val="normaltextrun"/>
+        </w:rPr>
+        <w:t>musiciens</w:t>
+      </w:r>
+      <w:proofErr w:type="gramEnd"/>
+      <w:r>
+        <w:rPr>
+          <w:rStyle w:val="normaltextrun"/>
+        </w:rPr>
+        <w:t>, …).</w:t>
       </w:r>
       <w:r>
         <w:rPr>
@@ -2125,31 +2365,105 @@
         </w:rPr>
         <w:t> </w:t>
       </w:r>
-      <w:r>
-        <w:t>Runeo-Desk</w:t>
+      <w:proofErr w:type="spellStart"/>
+      <w:r>
+        <w:t>Runeo</w:t>
+      </w:r>
+      <w:proofErr w:type="spellEnd"/>
+      <w:r>
+        <w:t>-Desk</w:t>
       </w:r>
       <w:r>
         <w:t xml:space="preserve"> </w:t>
       </w:r>
       <w:r>
-        <w:t>et Runeo-Drive sont</w:t>
+        <w:t xml:space="preserve">et </w:t>
+      </w:r>
+      <w:proofErr w:type="spellStart"/>
+      <w:r>
+        <w:t>Runeo</w:t>
+      </w:r>
+      <w:proofErr w:type="spellEnd"/>
+      <w:r>
+        <w:t>-Drive sont</w:t>
       </w:r>
       <w:r>
         <w:t xml:space="preserve"> en service depuis 2019</w:t>
       </w:r>
       <w:r>
-        <w:t>. Runeo-Desk sert à la préparation des courses (« runs ») à partir des bureaux du festival, Runeo-Drive sert aux chauffeurs pour gérer l’exécution des runs.</w:t>
+        <w:t xml:space="preserve">. </w:t>
+      </w:r>
+      <w:proofErr w:type="spellStart"/>
+      <w:r>
+        <w:t>Runeo</w:t>
+      </w:r>
+      <w:proofErr w:type="spellEnd"/>
+      <w:r>
+        <w:t>-Desk sert à la préparation des courses (« </w:t>
+      </w:r>
+      <w:proofErr w:type="spellStart"/>
+      <w:r>
+        <w:t>runs</w:t>
+      </w:r>
+      <w:proofErr w:type="spellEnd"/>
+      <w:r>
+        <w:t xml:space="preserve"> ») à partir des bureaux du festival, </w:t>
+      </w:r>
+      <w:proofErr w:type="spellStart"/>
+      <w:r>
+        <w:t>Runeo</w:t>
+      </w:r>
+      <w:proofErr w:type="spellEnd"/>
+      <w:r>
+        <w:t xml:space="preserve">-Drive sert aux chauffeurs pour gérer l’exécution des </w:t>
+      </w:r>
+      <w:proofErr w:type="spellStart"/>
+      <w:r>
+        <w:t>runs</w:t>
+      </w:r>
+      <w:proofErr w:type="spellEnd"/>
+      <w:r>
+        <w:t>.</w:t>
       </w:r>
     </w:p>
     <w:p>
       <w:pPr>
         <w:pStyle w:val="Corpsdetexte"/>
       </w:pPr>
-      <w:r>
-        <w:t xml:space="preserve">Runeo-Drive est développée en React Native et </w:t>
-      </w:r>
-      <w:r>
-        <w:t>distribuée sur le PlayStore Android et l’AppStore Apple.</w:t>
+      <w:proofErr w:type="spellStart"/>
+      <w:r>
+        <w:t>Runeo</w:t>
+      </w:r>
+      <w:proofErr w:type="spellEnd"/>
+      <w:r>
+        <w:t xml:space="preserve">-Drive est développée en </w:t>
+      </w:r>
+      <w:proofErr w:type="spellStart"/>
+      <w:r>
+        <w:t>React</w:t>
+      </w:r>
+      <w:proofErr w:type="spellEnd"/>
+      <w:r>
+        <w:t xml:space="preserve"> Native et </w:t>
+      </w:r>
+      <w:r>
+        <w:t xml:space="preserve">distribuée sur le </w:t>
+      </w:r>
+      <w:proofErr w:type="spellStart"/>
+      <w:r>
+        <w:t>PlayStore</w:t>
+      </w:r>
+      <w:proofErr w:type="spellEnd"/>
+      <w:r>
+        <w:t xml:space="preserve"> Android et l’</w:t>
+      </w:r>
+      <w:proofErr w:type="spellStart"/>
+      <w:r>
+        <w:t>AppStore</w:t>
+      </w:r>
+      <w:proofErr w:type="spellEnd"/>
+      <w:r>
+        <w:t xml:space="preserve"> Apple.</w:t>
       </w:r>
     </w:p>
     <w:p>
@@ -2165,11 +2479,24 @@
       <w:r>
         <w:t xml:space="preserve">de </w:t>
       </w:r>
-      <w:r>
-        <w:t xml:space="preserve">Fyord est de </w:t>
-      </w:r>
-      <w:r>
-        <w:t>faire évoluer Runeo-Drive pour satisfaire les besoins des chauffeurs</w:t>
+      <w:proofErr w:type="spellStart"/>
+      <w:r>
+        <w:t>Fyord</w:t>
+      </w:r>
+      <w:proofErr w:type="spellEnd"/>
+      <w:r>
+        <w:t xml:space="preserve"> est de </w:t>
+      </w:r>
+      <w:r>
+        <w:t xml:space="preserve">faire évoluer </w:t>
+      </w:r>
+      <w:proofErr w:type="spellStart"/>
+      <w:r>
+        <w:t>Runeo</w:t>
+      </w:r>
+      <w:proofErr w:type="spellEnd"/>
+      <w:r>
+        <w:t>-Drive pour satisfaire les besoins des chauffeurs</w:t>
       </w:r>
       <w:r>
         <w:t>.</w:t>
@@ -2179,8 +2506,29 @@
       <w:pPr>
         <w:pStyle w:val="Corpsdetexte"/>
       </w:pPr>
-      <w:r>
-        <w:t xml:space="preserve">Fyord dispose à ce jour d’une équipe de développement très réduite et compte s’appuyer dans un premier temps sur plusieurs développeurs freelance. Un accord a été passé entre Fyord et l’ETML </w:t>
+      <w:proofErr w:type="spellStart"/>
+      <w:r>
+        <w:t>Fyord</w:t>
+      </w:r>
+      <w:proofErr w:type="spellEnd"/>
+      <w:r>
+        <w:t xml:space="preserve"> dispose à ce jour d’une équipe de développement très réduite et compte s’appuyer dans un premier temps sur </w:t>
+      </w:r>
+      <w:proofErr w:type="gramStart"/>
+      <w:r>
+        <w:t>plusieurs développeurs freelance</w:t>
+      </w:r>
+      <w:proofErr w:type="gramEnd"/>
+      <w:r>
+        <w:t xml:space="preserve">. Un accord a été passé entre </w:t>
+      </w:r>
+      <w:proofErr w:type="spellStart"/>
+      <w:r>
+        <w:t>Fyord</w:t>
+      </w:r>
+      <w:proofErr w:type="spellEnd"/>
+      <w:r>
+        <w:t xml:space="preserve"> et l’ETML </w:t>
       </w:r>
       <w:r>
         <w:lastRenderedPageBreak/>
@@ -2196,7 +2544,11 @@
         <w:t>r</w:t>
       </w:r>
       <w:r>
-        <w:t xml:space="preserve"> dans le cadre de la formation d’informaticien</w:t>
+        <w:t xml:space="preserve"> dans le cadre de la formation d’</w:t>
+      </w:r>
+      <w:proofErr w:type="spellStart"/>
+      <w:r>
+        <w:t>informaticien</w:t>
       </w:r>
       <w:r>
         <w:rPr>
@@ -2205,7 +2557,11 @@
         <w:t>ne</w:t>
       </w:r>
       <w:r>
-        <w:t>·ne à l’ETML.</w:t>
+        <w:t>·ne</w:t>
+      </w:r>
+      <w:proofErr w:type="spellEnd"/>
+      <w:r>
+        <w:t xml:space="preserve"> à l’ETML.</w:t>
       </w:r>
     </w:p>
     <w:p>
@@ -2215,8 +2571,29 @@
       <w:r>
         <w:t xml:space="preserve">Ce projet </w:t>
       </w:r>
-      <w:r>
-        <w:t xml:space="preserve">Runeo-Drive est avant tout un « enabling project », c’est-à-dire qu’il a pour but de prendre en mains la technologie, l’environnement de travail et la méthodologie nécessaires pour pouvoir contribuer au produit. Il </w:t>
+      <w:proofErr w:type="spellStart"/>
+      <w:r>
+        <w:t>Runeo</w:t>
+      </w:r>
+      <w:proofErr w:type="spellEnd"/>
+      <w:r>
+        <w:t>-Drive est avant tout un « </w:t>
+      </w:r>
+      <w:proofErr w:type="spellStart"/>
+      <w:r>
+        <w:t>enabling</w:t>
+      </w:r>
+      <w:proofErr w:type="spellEnd"/>
+      <w:r>
+        <w:t xml:space="preserve"> </w:t>
+      </w:r>
+      <w:proofErr w:type="spellStart"/>
+      <w:r>
+        <w:t>project</w:t>
+      </w:r>
+      <w:proofErr w:type="spellEnd"/>
+      <w:r>
+        <w:t xml:space="preserve"> », c’est-à-dire qu’il a pour but de prendre en mains la technologie, l’environnement de travail et la méthodologie nécessaires pour pouvoir contribuer au produit. Il </w:t>
       </w:r>
       <w:r>
         <w:t>doit servir</w:t>
@@ -2291,7 +2668,15 @@
         <w:t xml:space="preserve">Ajouter l’heure </w:t>
       </w:r>
       <w:r>
-        <w:t>du prochain run prévu pour chaque véhicule</w:t>
+        <w:t xml:space="preserve">du prochain </w:t>
+      </w:r>
+      <w:proofErr w:type="spellStart"/>
+      <w:r>
+        <w:t>run</w:t>
+      </w:r>
+      <w:proofErr w:type="spellEnd"/>
+      <w:r>
+        <w:t xml:space="preserve"> prévu pour chaque véhicule</w:t>
       </w:r>
     </w:p>
     <w:p>
@@ -2306,7 +2691,23 @@
         <w:t xml:space="preserve">Faire que </w:t>
       </w:r>
       <w:r>
-        <w:t>la liste des runs soit automatiquement rafraîchie au moment où l’app obtient le focus</w:t>
+        <w:t xml:space="preserve">la liste des </w:t>
+      </w:r>
+      <w:proofErr w:type="spellStart"/>
+      <w:r>
+        <w:t>runs</w:t>
+      </w:r>
+      <w:proofErr w:type="spellEnd"/>
+      <w:r>
+        <w:t xml:space="preserve"> soit automatiquement rafraîchie au moment où </w:t>
+      </w:r>
+      <w:proofErr w:type="spellStart"/>
+      <w:r>
+        <w:t>l’app</w:t>
+      </w:r>
+      <w:proofErr w:type="spellEnd"/>
+      <w:r>
+        <w:t xml:space="preserve"> obtient le focus</w:t>
       </w:r>
     </w:p>
     <w:p>
@@ -2318,7 +2719,15 @@
         </w:numPr>
       </w:pPr>
       <w:r>
-        <w:t>Mettre en évidence les runs à compléter</w:t>
+        <w:t xml:space="preserve">Mettre en évidence les </w:t>
+      </w:r>
+      <w:proofErr w:type="spellStart"/>
+      <w:r>
+        <w:t>runs</w:t>
+      </w:r>
+      <w:proofErr w:type="spellEnd"/>
+      <w:r>
+        <w:t xml:space="preserve"> à compléter</w:t>
       </w:r>
       <w:r>
         <w:t xml:space="preserve"> en termes de chauffeurs plutôt que de véhicule</w:t>
@@ -2393,7 +2802,15 @@
         </w:numPr>
       </w:pPr>
       <w:r>
-        <w:t>Le code produit, sous forme de commits Git</w:t>
+        <w:t xml:space="preserve">Le code produit, sous forme de </w:t>
+      </w:r>
+      <w:proofErr w:type="spellStart"/>
+      <w:r>
+        <w:t>commits</w:t>
+      </w:r>
+      <w:proofErr w:type="spellEnd"/>
+      <w:r>
+        <w:t xml:space="preserve"> Git</w:t>
       </w:r>
     </w:p>
     <w:p>
@@ -2464,7 +2881,23 @@
         </w:numPr>
       </w:pPr>
       <w:r>
-        <w:t>La mise en œuvre des bonnes pratiques de gestion de versions (nommage des commits, gitflow)</w:t>
+        <w:t xml:space="preserve">La mise en œuvre des bonnes pratiques de gestion de versions (nommage des </w:t>
+      </w:r>
+      <w:proofErr w:type="spellStart"/>
+      <w:r>
+        <w:t>commits</w:t>
+      </w:r>
+      <w:proofErr w:type="spellEnd"/>
+      <w:r>
+        <w:t xml:space="preserve">, </w:t>
+      </w:r>
+      <w:proofErr w:type="spellStart"/>
+      <w:r>
+        <w:t>gitflow</w:t>
+      </w:r>
+      <w:proofErr w:type="spellEnd"/>
+      <w:r>
+        <w:t>)</w:t>
       </w:r>
     </w:p>
     <w:p>
@@ -2512,8 +2945,13 @@
         </w:numPr>
       </w:pPr>
       <w:r>
-        <w:t>L’affichage de l’heure du prochain run</w:t>
-      </w:r>
+        <w:t xml:space="preserve">L’affichage de l’heure du prochain </w:t>
+      </w:r>
+      <w:proofErr w:type="spellStart"/>
+      <w:r>
+        <w:t>run</w:t>
+      </w:r>
+      <w:proofErr w:type="spellEnd"/>
     </w:p>
     <w:p>
       <w:pPr>
@@ -6097,7 +6535,7 @@
 </file>
 
 <file path=customXml/itemProps1.xml><?xml version="1.0" encoding="utf-8"?>
-<ds:datastoreItem xmlns:ds="http://schemas.openxmlformats.org/officeDocument/2006/customXml" ds:itemID="{B15E083A-92D9-4D62-A222-5F01DE6071A5}">
+<ds:datastoreItem xmlns:ds="http://schemas.openxmlformats.org/officeDocument/2006/customXml" ds:itemID="{547DBC58-FA89-49BC-AA95-C518B9999929}">
   <ds:schemaRefs>
     <ds:schemaRef ds:uri="http://schemas.openxmlformats.org/officeDocument/2006/bibliography"/>
   </ds:schemaRefs>

</xml_diff>